<commit_message>
Use AE midpoint construction for capstone third part and explain its connection
</commit_message>
<xml_diff>
--- a/materials/grade8_extra/challenge_detailed.docx
+++ b/materials/grade8_extra/challenge_detailed.docx
@@ -741,12 +741,12 @@
         <w:pStyle w:val="Heading1"/>
       </w:pPr>
       <w:r>
-        <w:t>第（3）问｜第1步：辅助点T是怎样反推出来的？</w:t>
+        <w:t>第（3）问｜第1步：倍长AE，先把AB复制到CH</w:t>
       </w:r>
     </w:p>
     <w:p>
       <w:r>
-        <w:t>为什么这样想：E是BC中点。若想让EF平行于某条新边TB，就应让F成为TC的中点。因此先反推：怎样取T才能使TF=FC？</w:t>
+        <w:t>为什么这样想：沿用“倍长中线、构造全等”的方法。E是BC中点；连接AE并倍长后，能把AB复制到C处，与原有的CD比较。</w:t>
       </w:r>
     </w:p>
     <w:p>
@@ -762,7 +762,7 @@
               <a:graphicData uri="http://schemas.openxmlformats.org/drawingml/2006/picture">
                 <pic:pic>
                   <pic:nvPicPr>
-                    <pic:cNvPr id="0" name="h3_construct.png"/>
+                    <pic:cNvPr id="0" name="ae_sas.png"/>
                     <pic:cNvPicPr/>
                   </pic:nvPicPr>
                   <pic:blipFill>
@@ -787,32 +787,32 @@
     </w:p>
     <w:p>
       <w:r>
-        <w:t>看图／作图：延长CA过A至T，使AT=CD（也等于AB）；本页先只看这条直线上的长度。</w:t>
+        <w:t>看图／作图：连接AE，延长AE过E至H，使EH=EA；连接CH、DH。本问H按这个作法重新定义。</w:t>
       </w:r>
     </w:p>
     <w:p>
       <w:r>
-        <w:t>① A、F、D、C依次共线，AF=FD（F是AD中点）。</w:t>
+        <w:t>① AE=EH（作图），BE=EC（E是BC中点）。</w:t>
         <w:br/>
-        <w:t>② 若T放在A外侧，则TF=TA+AF，而FC=FD+DC。</w:t>
+        <w:t>② A、E、H共线，B、E、C共线，故∠AEB=∠HEC（对顶角）。</w:t>
         <w:br/>
-        <w:t>③ 因为AF=FD，只要取TA=DC，就能使上述两段相等。</w:t>
+        <w:t>③ 所以△AEB≌△HEC（SAS），对应为A↔H、E↔E、B↔C。</w:t>
         <w:br/>
-        <w:t>④ 因此作T，使AT=CD。再用CD=AB，得AT=AB。</w:t>
+        <w:t>④ 得CH=AB；结合AB=CD，得CH=CD。</w:t>
         <w:br/>
-        <w:t>⑤ 此时T、A、F、D、C依次共线，</w:t>
+        <w:t>⑤ 还得∠ABE=∠HCE（对应角）。</w:t>
         <w:br/>
-        <w:t xml:space="preserve">   TF=TA+AF=DC+FD=FC，所以F是TC的中点。</w:t>
+        <w:t>⑥ 这两个角是一组内错角，故AB∥CH。</w:t>
       </w:r>
     </w:p>
     <w:p>
       <w:r>
-        <w:t>本页结论：取T的目的：把“F是AD中点”变成“F也是TC中点”；同时得到AT=AB。</w:t>
+        <w:t>本页结论：CH=CD，AB∥CH；E既是BC中点，也是AH中点。</w:t>
       </w:r>
     </w:p>
     <w:p>
       <w:r>
-        <w:t>讲解提醒：T不是凭空猜出来的：先想要TF=FC，再倒推应取TA=DC。</w:t>
+        <w:t>讲解提醒：本问H在AE的延长线上，与前两问BF延长线上的H分别定义，不能混用。</w:t>
       </w:r>
     </w:p>
     <w:p>
@@ -825,12 +825,12 @@
         <w:pStyle w:val="Heading1"/>
       </w:pPr>
       <w:r>
-        <w:t>第（3）问｜第2步：60°先使哪个三角形等边？</w:t>
+        <w:t>第（3）问｜第2步：在哪个三角形里得到EF∥DH？</w:t>
       </w:r>
     </w:p>
     <w:p>
       <w:r>
-        <w:t>为什么这样想：现在E、F已成为△TBC两边的中点。先得到EF∥TB，把已知60°转移到T处；AT=AB便能接着发挥作用。</w:t>
+        <w:t>为什么这样想：F是AD中点；倍长AE又让E成为AH中点。于是这两个中点落在△ADH的两条边上，正好能把EF与DH联系起来。</w:t>
       </w:r>
     </w:p>
     <w:p>
@@ -846,7 +846,7 @@
               <a:graphicData uri="http://schemas.openxmlformats.org/drawingml/2006/picture">
                 <pic:pic>
                   <pic:nvPicPr>
-                    <pic:cNvPr id="0" name="h3_tab.png"/>
+                    <pic:cNvPr id="0" name="ae_mid.png"/>
                     <pic:cNvPicPr/>
                   </pic:nvPicPr>
                   <pic:blipFill>
@@ -871,32 +871,30 @@
     </w:p>
     <w:p>
       <w:r>
-        <w:t>看图／作图：连接TB，突出△TAB，标出T处与F处对应的60°。</w:t>
+        <w:t>看图／作图：突出△ADH：E在AH上、F在AD上，连接两个中点得到EF。</w:t>
       </w:r>
     </w:p>
     <w:p>
       <w:r>
-        <w:t>① 在△TBC中，E是BC中点，F是TC中点，故EF∥TB。</w:t>
+        <w:t>① 在△ADH中，AF=FD，所以F是AD中点。</w:t>
         <w:br/>
-        <w:t>② 直线TC为截线，∠BTA与∠EFC为同位角。</w:t>
+        <w:t>② A、E、H共线且AE=EH，所以E是AH中点。</w:t>
         <w:br/>
-        <w:t xml:space="preserve">   因而∠BTA=∠EFC=60°。</w:t>
+        <w:t>③ 由中点连线性质，EF∥DH。</w:t>
         <w:br/>
-        <w:t>③ AT=AB，故△TAB中∠TBA=∠BTA=60°。</w:t>
+        <w:t>④ 又G、F、E共线，因此GF∥DH。</w:t>
         <w:br/>
-        <w:t>④ 由三角形内角和，∠TAB=180°-60°-60°=60°。</w:t>
-        <w:br/>
-        <w:t>⑤ 三个角都为60°，所以△TAB是等边三角形。</w:t>
+        <w:t>⑤ 连同上页AB∥CH及G、A、B共线，还得到AG∥CH。</w:t>
       </w:r>
     </w:p>
     <w:p>
       <w:r>
-        <w:t>本页结论：△TAB等边，∠TAB=∠BTA=∠TBA=60°，且EF∥TB。</w:t>
+        <w:t>本页结论：两组关键平行：GF∥DH，AG∥CH。它们正是通向△AGD的桥梁。</w:t>
       </w:r>
     </w:p>
     <w:p>
       <w:r>
-        <w:t>讲解提醒：已知的60°是∠EFC；这里必须先证EF∥TB，才可以把它搬到T。</w:t>
+        <w:t>讲解提醒：这里使用的是△ADH的中点连线，不是△ABC的中点连线。</w:t>
       </w:r>
     </w:p>
     <w:p>
@@ -909,12 +907,12 @@
         <w:pStyle w:val="Heading1"/>
       </w:pPr>
       <w:r>
-        <w:t>第（3）问｜第3步：A处的60°怎样得到？</w:t>
+        <w:t>第（3）问｜第3步：严格证明你找到的△DHC等边</w:t>
       </w:r>
     </w:p>
     <w:p>
       <w:r>
-        <w:t>为什么这样想：最终要看△AGD，而△TAB在另一侧。先利用A点两条交叉的直线，把等边△TAB的60°转到△AGF中。</w:t>
+        <w:t>为什么这样想：上面已经得到CH=CD。再把∠EFC=60°移到D处，就能确定等腰△DHC的两个底角，从而得到等边。</w:t>
       </w:r>
     </w:p>
     <w:p>
@@ -930,7 +928,7 @@
               <a:graphicData uri="http://schemas.openxmlformats.org/drawingml/2006/picture">
                 <pic:pic>
                   <pic:nvPicPr>
-                    <pic:cNvPr id="0" name="h3_at_a.png"/>
+                    <pic:cNvPr id="0" name="ae_equilateral.png"/>
                     <pic:cNvPicPr/>
                   </pic:nvPicPr>
                   <pic:blipFill>
@@ -955,30 +953,30 @@
     </w:p>
     <w:p>
       <w:r>
-        <w:t>看图／作图：单独画出G—A—B与T—A—F两条相交直线；同色弧标出一对对顶角。</w:t>
+        <w:t>看图／作图：突出△DHC，并比较F处∠EFC与D处∠CDH。</w:t>
       </w:r>
     </w:p>
     <w:p>
       <w:r>
-        <w:t>① G在BA越过A的延长线上，所以G、A、B依次共线。</w:t>
+        <w:t>① EF∥DH，且FC与DC在同一直线上、方向相同。</w:t>
         <w:br/>
-        <w:t>② T在CA越过A的延长线上，且F在AC上，所以T、A、F依次共线。</w:t>
+        <w:t>② ∠CDH与∠EFC是同位角，所以∠CDH=60°。</w:t>
         <w:br/>
-        <w:t>③ 因而射线AG与AB反向，射线AF与AT反向。</w:t>
+        <w:t>③ CH=CD，因此△DHC是等腰三角形，底边是DH。</w:t>
         <w:br/>
-        <w:t>④ ∠GAF与∠TAB是一对对顶角，大小相等。</w:t>
+        <w:t>④ ∠DHC=∠CDH=60°（等边对等角）。</w:t>
         <w:br/>
-        <w:t>⑤ 上页得到∠TAB=60°，故∠GAF=60°。</w:t>
+        <w:t>⑤ ∠HCD=180°-60°-60°=60°，故△DHC是等边三角形。</w:t>
       </w:r>
     </w:p>
     <w:p>
       <w:r>
-        <w:t>本页结论：△AGF在A处的角为60°；还需再确定它的另一个角。</w:t>
+        <w:t>本页结论：△DHC等边。相等边CH、CD的公共顶点是C，底角在D、H。</w:t>
       </w:r>
     </w:p>
     <w:p>
       <w:r>
-        <w:t>讲解提醒：请先在图上指出组成∠TAB的两条射线，再找各自的反向射线。</w:t>
+        <w:t>讲解提醒：这里已确认你的构造可行；下一步不直接判断△AGD，先转看△AGF。</w:t>
       </w:r>
     </w:p>
     <w:p>
@@ -991,12 +989,12 @@
         <w:pStyle w:val="Heading1"/>
       </w:pPr>
       <w:r>
-        <w:t>第（3）问｜第4步：F处再得60°，得到第二个等边三角形</w:t>
+        <w:t>第（3）问｜第4步：从△DHC转到△AGF，是关键的一步</w:t>
       </w:r>
     </w:p>
     <w:p>
       <w:r>
-        <w:t>为什么这样想：只知道一个60°还不能认定等边。利用GF所在直线与TB平行，再得到F处的60°，才能推出GF=AF。</w:t>
+        <w:t>为什么这样想：△AGD暂时缺少边长关系。但F是AD中点，只要先证明△AGF等边，就能得到GF=AF=FD，再使用等腰△GFD。</w:t>
       </w:r>
     </w:p>
     <w:p>
@@ -1012,7 +1010,7 @@
               <a:graphicData uri="http://schemas.openxmlformats.org/drawingml/2006/picture">
                 <pic:pic>
                   <pic:nvPicPr>
-                    <pic:cNvPr id="0" name="h3_at_f.png"/>
+                    <pic:cNvPr id="0" name="ae_agf.png"/>
                     <pic:cNvPicPr/>
                   </pic:nvPicPr>
                   <pic:blipFill>
@@ -1037,32 +1035,34 @@
     </w:p>
     <w:p>
       <w:r>
-        <w:t>看图／作图：突出平行的TB、FG，以及截线TC；比较T处和F处的一组内错角。</w:t>
+        <w:t>看图／作图：上方突出△AGF，下方突出△DHC；A、F、D、C共线，两组斜边分别平行。</w:t>
       </w:r>
     </w:p>
     <w:p>
       <w:r>
-        <w:t>① G、F、E共线，且EF∥TB，所以FG∥TB。</w:t>
+        <w:t>① AG∥CH；AG与CH反向，AF与CD也反向。</w:t>
         <w:br/>
-        <w:t>② 直线TC截平行线TB、FG，∠BTA与∠AFG是一组内错角。</w:t>
+        <w:t xml:space="preserve">   两条射线同时反向，所以∠GAF=∠HCD=60°。</w:t>
         <w:br/>
-        <w:t xml:space="preserve">   因而∠AFG=∠BTA=60°。</w:t>
+        <w:t>② GF∥DH；FA与DC反向，FG与DH也反向。</w:t>
         <w:br/>
-        <w:t>③ 上页已得∠GAF=60°，所以∠AGF=180°-60°-60°=60°。</w:t>
+        <w:t xml:space="preserve">   所以∠AFG=∠CDH=60°。</w:t>
         <w:br/>
-        <w:t>④ △AGF三个角均为60°，故为等边三角形，AG=GF=AF。</w:t>
+        <w:t>③ △AGF的第三个角∠AGF=180°-60°-60°=60°。</w:t>
         <w:br/>
-        <w:t>⑤ 原题F是AD中点，AF=FD，所以GF=FD。</w:t>
+        <w:t>④ 因而△AGF等边，得到AG=GF=AF。</w:t>
+        <w:br/>
+        <w:t>⑤ 原题AF=FD，所以GF=FD。</w:t>
       </w:r>
     </w:p>
     <w:p>
       <w:r>
-        <w:t>本页结论：△AGF等边；尤其GF=AF=FD，这是下一步判断等腰的依据。</w:t>
+        <w:t>本页结论：由等边△DHC的角，得到等边△AGF，再得到GF=FD。</w:t>
       </w:r>
     </w:p>
     <w:p>
       <w:r>
-        <w:t>讲解提醒：F处的60°是∠AFG；相邻的∠GFD还没有算，它不是60°。</w:t>
+        <w:t>讲解提醒：直接连接两种结构的不是GD，而是GF：它既在等边△AGF中，又在等腰△GFD中。</w:t>
       </w:r>
     </w:p>
     <w:p>
@@ -1282,7 +1282,7 @@
     </w:p>
     <w:p>
       <w:r>
-        <w:t>反推TF=FC，取TA=DC → EF∥TB → △TAB等边 → 对顶角和内错角使△AGF等边 → GF=AF=FD → △GFD等腰，得120°及两个30° → 在G处相加60°+30°，所以△AGD直角。</w:t>
+        <w:t>延长AE至H，使EH=EA → △AEB≌△HEC → CH=CD且CH∥AB → △ADH中EF∥DH → △DHC等边 → 两组平行把60°转到△AGF，使它等边 → GF=AF=FD → △GFD等腰，得两个30° → 在G处相加60°+30°，所以△AGD直角。</w:t>
       </w:r>
     </w:p>
     <w:p>
@@ -1295,9 +1295,9 @@
     </w:p>
     <w:p>
       <w:r>
-        <w:t>问：为什么T在A外侧？答：这样TF=TA+AF，能与FC=FD+DC逐项比较，取TA=DC即可。</w:t>
+        <w:t>问：△DHC怎样连到△AGD？答：先通过AG∥CH、GF∥DH，把60°转到△AGF，得到GF=AF=FD。</w:t>
         <w:br/>
-        <w:t>问：为何不能见60°就认等边？答：必须再用等腰条件或求出第二个60°。</w:t>
+        <w:t>问：能否得到△DHC等边就直接说△AGD直角？答：不能，必须补上△AGF等边及△GFD等腰的推理。</w:t>
         <w:br/>
         <w:t>问：GF=FD从哪来？答：△AGF等边给GF=AF，原中点给AF=FD。</w:t>
         <w:br/>
@@ -1314,7 +1314,7 @@
     </w:p>
     <w:p>
       <w:r>
-        <w:t>先让学生在原图上指出对应的三角形、边、角，再展示下一页。讲后遮住详解，要求学生重画H或T并复述每一个等号的理由。已经会的页可以跳过，无须把整份详解当作逐字朗读稿。</w:t>
+        <w:t>先让学生在原图上指出对应的三角形、边、角，再展示下一页。讲后遮住详解，要求学生重新倍长中线作H，并复述每一个等号的理由。第三问也可取T走另一条路线，但T不是必须的辅助点。</w:t>
       </w:r>
     </w:p>
     <w:sectPr>

</xml_diff>